<commit_message>
dffc_to_csv.py, dffc is uploaded properly
</commit_message>
<xml_diff>
--- a/Bench_predictions/Bench prediction log.docx
+++ b/Bench_predictions/Bench prediction log.docx
@@ -325,6 +325,764 @@
         </w:rPr>
         <w:t xml:space="preserve">                  3.1.5           py313h5eee18b_1  </w:t>
       </w:r>
+    </w:p>
+    <w:p>
+      <w:pPr>
+        <w:spacing w:after="0"/>
+        <w:rPr>
+          <w:rFonts w:asciiTheme="majorBidi" w:hAnsiTheme="majorBidi" w:cstheme="majorBidi"/>
+          <w:sz w:val="24"/>
+          <w:szCs w:val="24"/>
+          <w:lang w:val="en-US"/>
+        </w:rPr>
+      </w:pPr>
+    </w:p>
+    <w:p>
+      <w:pPr>
+        <w:spacing w:after="0"/>
+        <w:rPr>
+          <w:rFonts w:asciiTheme="majorBidi" w:hAnsiTheme="majorBidi" w:cstheme="majorBidi"/>
+          <w:sz w:val="24"/>
+          <w:szCs w:val="24"/>
+          <w:lang w:val="en-US"/>
+        </w:rPr>
+      </w:pPr>
+    </w:p>
+    <w:p>
+      <w:pPr>
+        <w:spacing w:after="0"/>
+        <w:rPr>
+          <w:lang w:val="en-US"/>
+        </w:rPr>
+      </w:pPr>
+      <w:r>
+        <w:rPr>
+          <w:lang w:val="en-US"/>
+        </w:rPr>
+        <w:t xml:space="preserve">The salaries in </w:t>
+      </w:r>
+      <w:proofErr w:type="spellStart"/>
+      <w:r>
+        <w:rPr>
+          <w:lang w:val="en-US"/>
+        </w:rPr>
+        <w:t>additionalOECD</w:t>
+      </w:r>
+      <w:proofErr w:type="spellEnd"/>
+      <w:r>
+        <w:rPr>
+          <w:lang w:val="en-US"/>
+        </w:rPr>
+        <w:t xml:space="preserve"> I divide by </w:t>
+      </w:r>
+      <w:proofErr w:type="spellStart"/>
+      <w:r>
+        <w:rPr>
+          <w:lang w:val="en-US"/>
+        </w:rPr>
+        <w:t>PPP_or_exch</w:t>
+      </w:r>
+      <w:proofErr w:type="spellEnd"/>
+      <w:r>
+        <w:rPr>
+          <w:lang w:val="en-US"/>
+        </w:rPr>
+        <w:t xml:space="preserve"> in order to get the values in USD. </w:t>
+      </w:r>
+    </w:p>
+    <w:p>
+      <w:pPr>
+        <w:spacing w:after="0"/>
+        <w:rPr>
+          <w:lang w:val="en-US"/>
+        </w:rPr>
+      </w:pPr>
+      <w:r>
+        <w:rPr>
+          <w:lang w:val="en-US"/>
+        </w:rPr>
+        <w:t>Is it current USD value?</w:t>
+      </w:r>
+    </w:p>
+    <w:p>
+      <w:pPr>
+        <w:spacing w:after="0"/>
+        <w:rPr>
+          <w:lang w:val="en-US"/>
+        </w:rPr>
+      </w:pPr>
+    </w:p>
+    <w:p>
+      <w:pPr>
+        <w:spacing w:after="0"/>
+      </w:pPr>
+      <w:r>
+        <w:t xml:space="preserve">In OECD data, when you see </w:t>
+      </w:r>
+      <w:r>
+        <w:rPr>
+          <w:b/>
+          <w:bCs/>
+        </w:rPr>
+        <w:t>EXCH</w:t>
+      </w:r>
+      <w:r>
+        <w:t xml:space="preserve"> under currency/exchange type, it means the data are </w:t>
+      </w:r>
+      <w:r>
+        <w:rPr>
+          <w:b/>
+          <w:bCs/>
+        </w:rPr>
+        <w:t>converted using the market exchange rate</w:t>
+      </w:r>
+      <w:r>
+        <w:t xml:space="preserve"> — i.e., nominal values in </w:t>
+      </w:r>
+      <w:r>
+        <w:rPr>
+          <w:b/>
+          <w:bCs/>
+        </w:rPr>
+        <w:t>U.S. dollars (or another reference currency)</w:t>
+      </w:r>
+      <w:r>
+        <w:t xml:space="preserve"> based on the </w:t>
+      </w:r>
+      <w:r>
+        <w:rPr>
+          <w:b/>
+          <w:bCs/>
+        </w:rPr>
+        <w:t>official exchange rate for that year</w:t>
+      </w:r>
+      <w:r>
+        <w:t>.</w:t>
+      </w:r>
+    </w:p>
+    <w:p>
+      <w:pPr>
+        <w:spacing w:after="0"/>
+      </w:pPr>
+      <w:r>
+        <w:rPr>
+          <w:rFonts w:ascii="Segoe UI Emoji" w:hAnsi="Segoe UI Emoji" w:cs="Segoe UI Emoji"/>
+        </w:rPr>
+        <w:t>✅</w:t>
+      </w:r>
+      <w:r>
+        <w:t xml:space="preserve"> Key distinctions in OECD tables:</w:t>
+      </w:r>
+    </w:p>
+    <w:tbl>
+      <w:tblPr>
+        <w:tblW w:w="0" w:type="auto"/>
+        <w:tblCellSpacing w:w="15" w:type="dxa"/>
+        <w:tblCellMar>
+          <w:top w:w="15" w:type="dxa"/>
+          <w:left w:w="15" w:type="dxa"/>
+          <w:bottom w:w="15" w:type="dxa"/>
+          <w:right w:w="15" w:type="dxa"/>
+        </w:tblCellMar>
+        <w:tblLook w:val="04A0" w:firstRow="1" w:lastRow="0" w:firstColumn="1" w:lastColumn="0" w:noHBand="0" w:noVBand="1"/>
+      </w:tblPr>
+      <w:tblGrid>
+        <w:gridCol w:w="649"/>
+        <w:gridCol w:w="5860"/>
+      </w:tblGrid>
+      <w:tr>
+        <w:trPr>
+          <w:tblHeader/>
+          <w:tblCellSpacing w:w="15" w:type="dxa"/>
+        </w:trPr>
+        <w:tc>
+          <w:tcPr>
+            <w:tcW w:w="0" w:type="auto"/>
+            <w:vAlign w:val="center"/>
+            <w:hideMark/>
+          </w:tcPr>
+          <w:p>
+            <w:pPr>
+              <w:spacing w:after="0"/>
+              <w:rPr>
+                <w:b/>
+                <w:bCs/>
+              </w:rPr>
+            </w:pPr>
+            <w:r>
+              <w:rPr>
+                <w:b/>
+                <w:bCs/>
+              </w:rPr>
+              <w:t>Type</w:t>
+            </w:r>
+          </w:p>
+        </w:tc>
+        <w:tc>
+          <w:tcPr>
+            <w:tcW w:w="0" w:type="auto"/>
+            <w:vAlign w:val="center"/>
+            <w:hideMark/>
+          </w:tcPr>
+          <w:p>
+            <w:pPr>
+              <w:spacing w:after="0"/>
+              <w:rPr>
+                <w:b/>
+                <w:bCs/>
+              </w:rPr>
+            </w:pPr>
+            <w:r>
+              <w:rPr>
+                <w:b/>
+                <w:bCs/>
+              </w:rPr>
+              <w:t>Meaning</w:t>
+            </w:r>
+          </w:p>
+        </w:tc>
+      </w:tr>
+      <w:tr>
+        <w:trPr>
+          <w:tblCellSpacing w:w="15" w:type="dxa"/>
+        </w:trPr>
+        <w:tc>
+          <w:tcPr>
+            <w:tcW w:w="0" w:type="auto"/>
+            <w:vAlign w:val="center"/>
+            <w:hideMark/>
+          </w:tcPr>
+          <w:p>
+            <w:pPr>
+              <w:spacing w:after="0"/>
+            </w:pPr>
+            <w:r>
+              <w:rPr>
+                <w:b/>
+                <w:bCs/>
+              </w:rPr>
+              <w:t>NAC</w:t>
+            </w:r>
+          </w:p>
+        </w:tc>
+        <w:tc>
+          <w:tcPr>
+            <w:tcW w:w="0" w:type="auto"/>
+            <w:vAlign w:val="center"/>
+            <w:hideMark/>
+          </w:tcPr>
+          <w:p>
+            <w:pPr>
+              <w:spacing w:after="0"/>
+            </w:pPr>
+            <w:r>
+              <w:t>National currency (original currency of the country)</w:t>
+            </w:r>
+          </w:p>
+        </w:tc>
+      </w:tr>
+      <w:tr>
+        <w:trPr>
+          <w:tblCellSpacing w:w="15" w:type="dxa"/>
+        </w:trPr>
+        <w:tc>
+          <w:tcPr>
+            <w:tcW w:w="0" w:type="auto"/>
+            <w:vAlign w:val="center"/>
+            <w:hideMark/>
+          </w:tcPr>
+          <w:p>
+            <w:pPr>
+              <w:spacing w:after="0"/>
+            </w:pPr>
+            <w:r>
+              <w:rPr>
+                <w:b/>
+                <w:bCs/>
+              </w:rPr>
+              <w:t>EXCH</w:t>
+            </w:r>
+          </w:p>
+        </w:tc>
+        <w:tc>
+          <w:tcPr>
+            <w:tcW w:w="0" w:type="auto"/>
+            <w:vAlign w:val="center"/>
+            <w:hideMark/>
+          </w:tcPr>
+          <w:p>
+            <w:pPr>
+              <w:spacing w:after="0"/>
+            </w:pPr>
+            <w:r>
+              <w:t xml:space="preserve">Converted to another currency using </w:t>
+            </w:r>
+            <w:r>
+              <w:rPr>
+                <w:b/>
+                <w:bCs/>
+              </w:rPr>
+              <w:t>market exchange rates</w:t>
+            </w:r>
+          </w:p>
+        </w:tc>
+      </w:tr>
+      <w:tr>
+        <w:trPr>
+          <w:tblCellSpacing w:w="15" w:type="dxa"/>
+        </w:trPr>
+        <w:tc>
+          <w:tcPr>
+            <w:tcW w:w="0" w:type="auto"/>
+            <w:vAlign w:val="center"/>
+            <w:hideMark/>
+          </w:tcPr>
+          <w:p>
+            <w:pPr>
+              <w:spacing w:after="0"/>
+            </w:pPr>
+            <w:r>
+              <w:rPr>
+                <w:b/>
+                <w:bCs/>
+              </w:rPr>
+              <w:t>PPP</w:t>
+            </w:r>
+          </w:p>
+        </w:tc>
+        <w:tc>
+          <w:tcPr>
+            <w:tcW w:w="0" w:type="auto"/>
+            <w:vAlign w:val="center"/>
+            <w:hideMark/>
+          </w:tcPr>
+          <w:p>
+            <w:pPr>
+              <w:spacing w:after="0"/>
+            </w:pPr>
+            <w:r>
+              <w:t xml:space="preserve">Converted using </w:t>
+            </w:r>
+            <w:r>
+              <w:rPr>
+                <w:b/>
+                <w:bCs/>
+              </w:rPr>
+              <w:t>purchasing power parity</w:t>
+            </w:r>
+          </w:p>
+        </w:tc>
+      </w:tr>
+    </w:tbl>
+    <w:p>
+      <w:pPr>
+        <w:spacing w:after="0"/>
+        <w:rPr>
+          <w:lang w:val="en-US"/>
+        </w:rPr>
+      </w:pPr>
+    </w:p>
+    <w:p>
+      <w:pPr>
+        <w:spacing w:after="0"/>
+        <w:rPr>
+          <w:lang w:val="en-US"/>
+        </w:rPr>
+      </w:pPr>
+    </w:p>
+    <w:p>
+      <w:pPr>
+        <w:spacing w:after="0"/>
+      </w:pPr>
+    </w:p>
+    <w:p>
+      <w:pPr>
+        <w:spacing w:after="0"/>
+      </w:pPr>
+      <w:r>
+        <w:t>extrapolate GDP</w:t>
+      </w:r>
+    </w:p>
+    <w:p>
+      <w:pPr>
+        <w:spacing w:after="0"/>
+      </w:pPr>
+      <w:r>
+        <w:t>so I need to make E and input output tables until 2035</w:t>
+      </w:r>
+    </w:p>
+    <w:p>
+      <w:pPr>
+        <w:spacing w:after="0"/>
+      </w:pPr>
+      <w:r>
+        <w:t>print all of this to excel</w:t>
+      </w:r>
+    </w:p>
+    <w:p>
+      <w:pPr>
+        <w:spacing w:after="0"/>
+      </w:pPr>
+      <w:r>
+        <w:t>then I will be able to do what I want with them.</w:t>
+      </w:r>
+    </w:p>
+    <w:p>
+      <w:pPr>
+        <w:spacing w:after="0"/>
+      </w:pPr>
+    </w:p>
+    <w:p>
+      <w:pPr>
+        <w:spacing w:after="0"/>
+      </w:pPr>
+      <w:r>
+        <w:t>I have E</w:t>
+      </w:r>
+    </w:p>
+    <w:p>
+      <w:pPr>
+        <w:spacing w:after="0"/>
+      </w:pPr>
+      <w:r>
+        <w:t xml:space="preserve">once </w:t>
+      </w:r>
+      <w:proofErr w:type="spellStart"/>
+      <w:r>
+        <w:t>Ihave</w:t>
+      </w:r>
+      <w:proofErr w:type="spellEnd"/>
+      <w:r>
+        <w:t xml:space="preserve"> GDP I can have E for the future as well</w:t>
+      </w:r>
+    </w:p>
+    <w:p>
+      <w:pPr>
+        <w:spacing w:after="0"/>
+      </w:pPr>
+      <w:r>
+        <w:t xml:space="preserve">for this I need </w:t>
+      </w:r>
+      <w:proofErr w:type="spellStart"/>
+      <w:r>
+        <w:t>gdp</w:t>
+      </w:r>
+      <w:proofErr w:type="spellEnd"/>
+      <w:r>
+        <w:t xml:space="preserve"> of the future - extrapolated GDP</w:t>
+      </w:r>
+    </w:p>
+    <w:p>
+      <w:pPr>
+        <w:spacing w:after="0"/>
+      </w:pPr>
+      <w:r>
+        <w:t xml:space="preserve">extrapolated </w:t>
+      </w:r>
+      <w:proofErr w:type="spellStart"/>
+      <w:r>
+        <w:t>gdp</w:t>
+      </w:r>
+      <w:proofErr w:type="spellEnd"/>
+      <w:r>
+        <w:t xml:space="preserve"> -&gt; E this is from world bank</w:t>
+      </w:r>
+    </w:p>
+    <w:p>
+      <w:pPr>
+        <w:spacing w:after="0"/>
+      </w:pPr>
+      <w:r>
+        <w:t>extrapolated final demand +E+GDP -&gt; EIA I will take final demand from input-output tables.</w:t>
+      </w:r>
+    </w:p>
+    <w:p>
+      <w:pPr>
+        <w:spacing w:after="0"/>
+      </w:pPr>
+      <w:r>
+        <w:t>I also need to split E to sectors E</w:t>
+      </w:r>
+    </w:p>
+    <w:p>
+      <w:pPr>
+        <w:spacing w:after="0"/>
+      </w:pPr>
+    </w:p>
+    <w:p>
+      <w:pPr>
+        <w:spacing w:after="0"/>
+      </w:pPr>
+      <w:r>
+        <w:t>8.10.25</w:t>
+      </w:r>
+    </w:p>
+    <w:p>
+      <w:pPr>
+        <w:spacing w:after="0"/>
+      </w:pPr>
+      <w:r>
+        <w:t>#</w:t>
+      </w:r>
+    </w:p>
+    <w:p>
+      <w:pPr>
+        <w:spacing w:after="0"/>
+      </w:pPr>
+      <w:r>
+        <w:t xml:space="preserve"># 1. upload </w:t>
+      </w:r>
+      <w:proofErr w:type="spellStart"/>
+      <w:r>
+        <w:t>worldbank</w:t>
+      </w:r>
+      <w:proofErr w:type="spellEnd"/>
+      <w:r>
+        <w:t xml:space="preserve"> GDP data + ARIMA forecast 16 years ahead</w:t>
+      </w:r>
+    </w:p>
+    <w:p>
+      <w:pPr>
+        <w:spacing w:after="0"/>
+      </w:pPr>
+      <w:r>
+        <w:t xml:space="preserve"># 1.2 print to excel </w:t>
+      </w:r>
+      <w:proofErr w:type="spellStart"/>
+      <w:r>
+        <w:t>GDP+forecast</w:t>
+      </w:r>
+      <w:proofErr w:type="spellEnd"/>
+      <w:r>
+        <w:t xml:space="preserve"> GDP. print in excel the name of the program that makes it.</w:t>
+      </w:r>
+    </w:p>
+    <w:p>
+      <w:pPr>
+        <w:spacing w:after="0"/>
+      </w:pPr>
+      <w:r>
+        <w:t># 2. predict compensation of employees E vector from GDP</w:t>
+      </w:r>
+    </w:p>
+    <w:p>
+      <w:pPr>
+        <w:spacing w:after="0"/>
+      </w:pPr>
+      <w:r>
+        <w:t xml:space="preserve"># 2.2 print to excel </w:t>
+      </w:r>
+      <w:proofErr w:type="spellStart"/>
+      <w:r>
+        <w:t>E+forecast</w:t>
+      </w:r>
+      <w:proofErr w:type="spellEnd"/>
+      <w:r>
+        <w:t xml:space="preserve"> E. print in excel the name of the program that makes it.</w:t>
+      </w:r>
+    </w:p>
+    <w:p>
+      <w:pPr>
+        <w:spacing w:after="0"/>
+      </w:pPr>
+      <w:r>
+        <w:t># 3. predict sectors E</w:t>
+      </w:r>
+    </w:p>
+    <w:p>
+      <w:pPr>
+        <w:spacing w:after="0"/>
+      </w:pPr>
+      <w:r>
+        <w:t xml:space="preserve"># 3.2 print to excel </w:t>
+      </w:r>
+      <w:proofErr w:type="spellStart"/>
+      <w:r>
+        <w:t>E+forecast</w:t>
+      </w:r>
+      <w:proofErr w:type="spellEnd"/>
+      <w:r>
+        <w:t xml:space="preserve"> E. print in excel the name of the program that makes it.</w:t>
+      </w:r>
+    </w:p>
+    <w:p>
+      <w:pPr>
+        <w:spacing w:after="0"/>
+      </w:pPr>
+      <w:r>
+        <w:t># 4. upload final demand F from OECD and use ARIMA to forecast forward</w:t>
+      </w:r>
+    </w:p>
+    <w:p>
+      <w:pPr>
+        <w:spacing w:after="0"/>
+      </w:pPr>
+      <w:r>
+        <w:t xml:space="preserve"># 4.2 print to excel </w:t>
+      </w:r>
+      <w:proofErr w:type="spellStart"/>
+      <w:r>
+        <w:t>F+forecast</w:t>
+      </w:r>
+      <w:proofErr w:type="spellEnd"/>
+      <w:r>
+        <w:t xml:space="preserve"> F. print in excel the name of the program that makes it.</w:t>
+      </w:r>
+    </w:p>
+    <w:p>
+      <w:pPr>
+        <w:spacing w:after="0"/>
+      </w:pPr>
+      <w:r>
+        <w:t># 5. create input-output tables for future years</w:t>
+      </w:r>
+    </w:p>
+    <w:p>
+      <w:pPr>
+        <w:spacing w:after="0"/>
+      </w:pPr>
+      <w:r>
+        <w:t># 6. print all to excel files</w:t>
+      </w:r>
+    </w:p>
+    <w:p>
+      <w:pPr>
+        <w:spacing w:after="0"/>
+      </w:pPr>
+    </w:p>
+    <w:p>
+      <w:pPr>
+        <w:spacing w:after="0"/>
+      </w:pPr>
+      <w:r>
+        <w:t xml:space="preserve">Multivariate_E_extrap03.py has all the </w:t>
+      </w:r>
+      <w:proofErr w:type="spellStart"/>
+      <w:r>
+        <w:t>dfoutput</w:t>
+      </w:r>
+      <w:proofErr w:type="spellEnd"/>
+      <w:r>
+        <w:t xml:space="preserve">, </w:t>
+      </w:r>
+      <w:proofErr w:type="spellStart"/>
+      <w:r>
+        <w:t>dfgdp</w:t>
+      </w:r>
+      <w:proofErr w:type="spellEnd"/>
+      <w:r>
+        <w:t xml:space="preserve">, </w:t>
+      </w:r>
+      <w:proofErr w:type="spellStart"/>
+      <w:r>
+        <w:t>dfE</w:t>
+      </w:r>
+      <w:proofErr w:type="spellEnd"/>
+      <w:r>
+        <w:t xml:space="preserve">, </w:t>
+      </w:r>
+      <w:proofErr w:type="spellStart"/>
+      <w:r>
+        <w:t>dfTc</w:t>
+      </w:r>
+      <w:proofErr w:type="spellEnd"/>
+      <w:r>
+        <w:t xml:space="preserve"> – </w:t>
+      </w:r>
+      <w:proofErr w:type="spellStart"/>
+      <w:r>
+        <w:t>everythingw</w:t>
+      </w:r>
+      <w:proofErr w:type="spellEnd"/>
+      <w:r>
+        <w:t xml:space="preserve"> e collect from the input-output tables year by year. </w:t>
+      </w:r>
+    </w:p>
+    <w:p>
+      <w:pPr>
+        <w:spacing w:after="0"/>
+      </w:pPr>
+      <w:r>
+        <w:t>Exectors_fromEtot05.py does not have this.</w:t>
+      </w:r>
+    </w:p>
+    <w:p>
+      <w:pPr>
+        <w:spacing w:after="0"/>
+      </w:pPr>
+    </w:p>
+    <w:p>
+      <w:pPr>
+        <w:spacing w:after="0"/>
+      </w:pPr>
+      <w:r>
+        <w:t>The order to run the files:</w:t>
+      </w:r>
+    </w:p>
+    <w:p>
+      <w:pPr>
+        <w:spacing w:after="0"/>
+      </w:pPr>
+      <w:r>
+        <w:t>04-&gt;03-&gt;05-&gt;06</w:t>
+      </w:r>
+    </w:p>
+    <w:p>
+      <w:pPr>
+        <w:spacing w:after="0"/>
+      </w:pPr>
+    </w:p>
+    <w:p>
+      <w:pPr>
+        <w:spacing w:after="0"/>
+      </w:pPr>
+      <w:r>
+        <w:t>Dffc_to_csv.py</w:t>
+      </w:r>
+    </w:p>
+    <w:p>
+      <w:pPr>
+        <w:spacing w:after="0"/>
+      </w:pPr>
+      <w:r>
+        <w:t>Multivariate_f_exatrap06?</w:t>
+      </w:r>
+    </w:p>
+    <w:p>
+      <w:pPr>
+        <w:spacing w:after="0"/>
+      </w:pPr>
+    </w:p>
+    <w:p>
+      <w:pPr>
+        <w:spacing w:after="0"/>
+      </w:pPr>
+      <w:proofErr w:type="spellStart"/>
+      <w:r>
+        <w:t>Suplychain</w:t>
+      </w:r>
+      <w:proofErr w:type="spellEnd"/>
+      <w:r>
+        <w:t xml:space="preserve"> </w:t>
+      </w:r>
+      <w:proofErr w:type="spellStart"/>
+      <w:r>
+        <w:t>gdp</w:t>
+      </w:r>
+      <w:proofErr w:type="spellEnd"/>
+      <w:r>
+        <w:t xml:space="preserve"> – I have a file by this name.</w:t>
+      </w:r>
+    </w:p>
+    <w:p>
+      <w:pPr>
+        <w:spacing w:after="0"/>
+        <w:rPr>
+          <w:rFonts w:asciiTheme="majorBidi" w:hAnsiTheme="majorBidi" w:cstheme="majorBidi"/>
+          <w:sz w:val="24"/>
+          <w:szCs w:val="24"/>
+        </w:rPr>
+      </w:pPr>
     </w:p>
     <w:sectPr>
       <w:pgSz w:w="11906" w:h="16838"/>

</xml_diff>